<commit_message>
docs: rewrite lab 3 report in a formal technical register
</commit_message>
<xml_diff>
--- a/Informe_Laboratorio_3.docx
+++ b/Informe_Laboratorio_3.docx
@@ -14,7 +14,7 @@
           <w:color w:val="000000"/>
           <w:sz w:val="32"/>
         </w:rPr>
-        <w:t>APLICACIONES MOVILES</w:t>
+        <w:t>APLICACIONES MÓVILES</w:t>
       </w:r>
     </w:p>
     <w:p>
@@ -82,7 +82,7 @@
           <w:color w:val="000000"/>
           <w:sz w:val="24"/>
         </w:rPr>
-        <w:t>Materia: Aplicaciones Moviles</w:t>
+        <w:t>Materia: Aplicaciones Móviles</w:t>
       </w:r>
     </w:p>
     <w:p>
@@ -123,7 +123,7 @@
           <w:color w:val="000000"/>
           <w:sz w:val="24"/>
         </w:rPr>
-        <w:t xml:space="preserve">Los tres laboratorios se desarrollaron en Android Studio Quail 2 (2026.1.2) con Android Gradle Plugin 9.3.3 (Kotlin 2.2.10 integrado), compileSdk y targetSdk 36 y minSdk 26, y se ejecutaron en el emulador Pixel 8. Cada laboratorio quedó en su carpeta del repositorio: Lab3A/AppTeca (modelo tradicional), Lab3B/AppTeca (el mismo proyecto refactorizado a MVVM) y Lab3C/AppTeca3 (proyecto nuevo en Compose). Los giros se hicieron con </w:t>
+        <w:t xml:space="preserve">Los tres laboratorios se desarrollaron en Android Studio Quail 2 (2026.1.2), con Android Gradle Plugin 9.3.3 (que incorpora Kotlin 2.2.10), compileSdk y targetSdk 36 y minSdk 26. Todas las pruebas se ejecutaron en el emulador Pixel 8. Cada laboratorio se encuentra en una carpeta del repositorio: Lab3A/AppTeca (modelo tradicional), Lab3B/AppTeca (el mismo proyecto refactorizado a MVVM) y Lab3C/AppTeca3 (proyecto nuevo en Jetpack Compose). Las rotaciones se realizaron con </w:t>
       </w:r>
       <w:r>
         <w:rPr>
@@ -141,7 +141,7 @@
           <w:color w:val="000000"/>
           <w:sz w:val="24"/>
         </w:rPr>
-        <w:t xml:space="preserve"> y la muerte de proceso con </w:t>
+        <w:t xml:space="preserve"> y la terminación del proceso con </w:t>
       </w:r>
       <w:r>
         <w:rPr>
@@ -159,7 +159,7 @@
           <w:color w:val="000000"/>
           <w:sz w:val="24"/>
         </w:rPr>
-        <w:t>, igual que en el Laboratorio 2.</w:t>
+        <w:t>, del mismo modo que en el Laboratorio 2.</w:t>
       </w:r>
     </w:p>
     <w:p>
@@ -206,7 +206,7 @@
           <w:color w:val="000000"/>
           <w:sz w:val="22"/>
         </w:rPr>
-        <w:t>Captura 1: AppTeca abierto en Android Studio; la app se compiló e instaló en el Pixel 8 desde el IDE ("Install successfully finished").</w:t>
+        <w:t>Captura 1: proyecto AppTeca abierto en Android Studio; la aplicación se compiló e instaló en el Pixel 8 desde el IDE.</w:t>
       </w:r>
     </w:p>
     <w:p>
@@ -217,7 +217,7 @@
           <w:color w:val="000000"/>
           <w:sz w:val="24"/>
         </w:rPr>
-        <w:t>Mis 8 aplicaciones favoritas, los datos de trabajo de las tres partes:</w:t>
+        <w:t>La tabla siguiente presenta las ocho aplicaciones seleccionadas, que constituyen el conjunto de datos utilizado en las tres partes:</w:t>
       </w:r>
     </w:p>
     <w:tbl>
@@ -261,7 +261,7 @@
                 <w:b/>
                 <w:sz w:val="22"/>
               </w:rPr>
-              <w:t>App</w:t>
+              <w:t>Aplicación</w:t>
             </w:r>
           </w:p>
         </w:tc>
@@ -277,7 +277,7 @@
                 <w:b/>
                 <w:sz w:val="22"/>
               </w:rPr>
-              <w:t>Categoria</w:t>
+              <w:t>Categoría</w:t>
             </w:r>
           </w:p>
         </w:tc>
@@ -293,7 +293,7 @@
                 <w:b/>
                 <w:sz w:val="22"/>
               </w:rPr>
-              <w:t>Por que me gusta</w:t>
+              <w:t>Motivo de elección</w:t>
             </w:r>
           </w:p>
         </w:tc>
@@ -363,7 +363,7 @@
                 <w:color w:val="000000"/>
                 <w:sz w:val="20"/>
               </w:rPr>
-              <w:t>La uso para todo: grupos de la facu, familia y hasta para mandarme cosas a mí mismo.</w:t>
+              <w:t>Es la herramienta principal de comunicación: grupos de la facultad, familia y notas personales.</w:t>
             </w:r>
           </w:p>
         </w:tc>
@@ -433,7 +433,7 @@
                 <w:color w:val="000000"/>
                 <w:sz w:val="20"/>
               </w:rPr>
-              <w:t>Las comunidades de programación y Android me resuelven dudas y me traen novedades.</w:t>
+              <w:t>Sus comunidades de programación, series y temas generales resultan entretenidas.</w:t>
             </w:r>
           </w:p>
         </w:tc>
@@ -503,7 +503,7 @@
                 <w:color w:val="000000"/>
                 <w:sz w:val="20"/>
               </w:rPr>
-              <w:t>Tutoriales de programación y charlas técnicas.</w:t>
+              <w:t>Ofrece tutoriales de programación y charlas técnicas.</w:t>
             </w:r>
           </w:p>
         </w:tc>
@@ -573,7 +573,7 @@
                 <w:color w:val="000000"/>
                 <w:sz w:val="20"/>
               </w:rPr>
-              <w:t>Sin Maps no llego a ningún lado nuevo; el modo transporte público es clave.</w:t>
+              <w:t>Resulta indispensable para desplazarse, en particular por su modo de transporte público.</w:t>
             </w:r>
           </w:p>
         </w:tc>
@@ -643,7 +643,7 @@
                 <w:color w:val="000000"/>
                 <w:sz w:val="20"/>
               </w:rPr>
-              <w:t>Servidores de estudio y de juego, con voz y pantalla compartida.</w:t>
+              <w:t>Reúne servidores de estudio y de juego, con comunicación por voz y pantalla compartida.</w:t>
             </w:r>
           </w:p>
         </w:tc>
@@ -713,7 +713,7 @@
                 <w:color w:val="000000"/>
                 <w:sz w:val="20"/>
               </w:rPr>
-              <w:t>Pagar con QR, transferir y dividir gastos sin efectivo.</w:t>
+              <w:t>Permite pagar con código QR, realizar transferencias y dividir gastos sin efectivo.</w:t>
             </w:r>
           </w:p>
         </w:tc>
@@ -783,7 +783,7 @@
                 <w:color w:val="000000"/>
                 <w:sz w:val="20"/>
               </w:rPr>
-              <w:t>La racha diaria me obliga a practicar inglés.</w:t>
+              <w:t>La racha diaria incentiva la práctica de idiomas, lo que permite acceder a contenido que no está disponible en español ni en inglés.</w:t>
             </w:r>
           </w:p>
         </w:tc>
@@ -853,7 +853,7 @@
                 <w:color w:val="000000"/>
                 <w:sz w:val="20"/>
               </w:rPr>
-              <w:t>Revisar repos, issues y PRs desde el teléfono.</w:t>
+              <w:t>Permite revisar repositorios, issues y pull requests desde el teléfono.</w:t>
             </w:r>
           </w:p>
         </w:tc>
@@ -885,7 +885,7 @@
           <w:color w:val="000000"/>
           <w:sz w:val="32"/>
         </w:rPr>
-        <w:t>Etapa 1 - El proyecto y tus datos</w:t>
+        <w:t>Etapa 1 - Creación del proyecto y modelo de datos</w:t>
       </w:r>
     </w:p>
     <w:p>
@@ -896,7 +896,7 @@
           <w:color w:val="000000"/>
           <w:sz w:val="24"/>
         </w:rPr>
-        <w:t>Se creó el proyecto AppTeca con la plantilla Empty Views Activity (Kotlin, API 26); activity_main.xml aparece bajo res &gt; layout, lo que confirma la plantilla correcta. Se agregaron App.kt (data class con id, nombre, categoria, descripcion y var esFavorita) y Catalogo.kt (un object singleton con las 8 apps y sus ids únicos). El id existe para que las pantallas se refieran a una app sin pasar el objeto entero; esFavorita es var porque en el modelo tradicional el estado se muta en el lugar.</w:t>
+        <w:t>Se creó el proyecto AppTeca a partir de la plantilla Empty Views Activity (Kotlin, API 26). La presencia de activity_main.xml en res &gt; layout confirma la selección de la plantilla correcta. Se incorporaron dos archivos: App.kt, una data class con los campos id, nombre, categoria, descripcion y esFavorita, y Catalogo.kt, un object (singleton) que contiene las ocho aplicaciones con identificadores únicos. El campo id permite que las pantallas se refieran a una aplicación sin transferir el objeto completo; esFavorita se declaró como var porque en el modelo tradicional el estado se modifica sobre el mismo objeto.</w:t>
       </w:r>
     </w:p>
     <w:p>
@@ -910,7 +910,7 @@
           <w:color w:val="000000"/>
           <w:sz w:val="32"/>
         </w:rPr>
-        <w:t>Etapa 2 - La lista: RecyclerView y su ceremonia</w:t>
+        <w:t>Etapa 2 - Lista con RecyclerView</w:t>
       </w:r>
     </w:p>
     <w:p>
@@ -921,7 +921,7 @@
           <w:color w:val="000000"/>
           <w:sz w:val="24"/>
         </w:rPr>
-        <w:t>Para mostrar la lista hicieron falta cuatro piezas: el layout de la fila (item_app.xml), el ViewHolder, el adaptador con sus tres métodos (onCreateViewHolder, onBindViewHolder, getItemCount) y el enganche en MainActivity (layoutManager + adapter). La dependencia recyclerview:1.3.2 se agregó al catálogo de versiones.</w:t>
+        <w:t>La visualización de la lista requirió cuatro componentes: el layout de cada fila (item_app.xml), el ViewHolder, el adaptador con sus tres métodos (onCreateViewHolder, onBindViewHolder y getItemCount) y la configuración en MainActivity (asignación de layoutManager y adapter). La dependencia recyclerview 1.3.2 se agregó al catálogo de versiones del proyecto.</w:t>
       </w:r>
     </w:p>
     <w:p>
@@ -935,7 +935,7 @@
           <w:color w:val="000000"/>
           <w:sz w:val="32"/>
         </w:rPr>
-        <w:t>Etapa 3 - El detalle: navegar con equipaje liviano</w:t>
+        <w:t>Etapa 3 - Pantalla de detalle</w:t>
       </w:r>
     </w:p>
     <w:p>
@@ -946,7 +946,7 @@
           <w:color w:val="000000"/>
           <w:sz w:val="24"/>
         </w:rPr>
-        <w:t>DetalleActivity recibe solo el id por el Intent (putExtra("appId", app.id)) y busca el dato en Catalogo; si el id no existe, aplica el plan B y se cierra con finish(). El adaptador no conoce Intents: avisa el toque con una lambda en el constructor y la Activity decide qué hacer.</w:t>
+        <w:t>DetalleActivity recibe únicamente el identificador de la aplicación mediante el Intent (putExtra("appId", app.id)) y obtiene el dato completo desde Catalogo. Si el identificador no existe, la pantalla se cierra con finish(). El adaptador no tiene conocimiento de los Intents: notifica el evento de selección mediante una función lambda recibida en su constructor, y la Activity determina la acción a realizar.</w:t>
       </w:r>
     </w:p>
     <w:p>
@@ -1033,7 +1033,7 @@
           <w:color w:val="000000"/>
           <w:sz w:val="22"/>
         </w:rPr>
-        <w:t>Captura 2: a la izquierda, las 8 apps con la estrella vacía (Etapa 2); a la derecha, tocar una fila abre su detalle (Etapa 3).</w:t>
+        <w:t>Captura 2: a la izquierda, la lista con las ocho aplicaciones (Etapa 2); a la derecha, la pantalla de detalle (Etapa 3).</w:t>
       </w:r>
     </w:p>
     <w:p>
@@ -1047,7 +1047,7 @@
           <w:color w:val="000000"/>
           <w:sz w:val="32"/>
         </w:rPr>
-        <w:t>Etapa 4 - Favoritos y filtros: el estado, y vos como sincronizador</w:t>
+        <w:t>Etapa 4 - Favoritos, filtros y sincronización manual</w:t>
       </w:r>
     </w:p>
     <w:p>
@@ -1058,7 +1058,7 @@
           <w:color w:val="000000"/>
           <w:sz w:val="24"/>
         </w:rPr>
-        <w:t>4.1: la estrella responde al toque con una segunda lambda; la Activity muta app.esFavorita y llama a notifyDataSetChanged(), la confesión del modelo: el dato cambió y la vista no se enteró sola.</w:t>
+        <w:t>4.1: se agregó una segunda función lambda para el ícono de favorito. La Activity modifica app.esFavorita e invoca notifyDataSetChanged(), lo que evidencia la característica central del modelo: la vista no detecta por sí misma los cambios en los datos y debe ser notificada explícitamente.</w:t>
       </w:r>
     </w:p>
     <w:p>
@@ -1069,7 +1069,7 @@
           <w:color w:val="000000"/>
           <w:sz w:val="24"/>
         </w:rPr>
-        <w:t>4.2, la primera grieta: se agregó el botón de favorito al detalle. Se entró a Google Maps (sin estrella), se la marcó desde el botón y se volvió atrás: la fila siguió mostrando la estrella vacía. El dato cambió en otra pantalla y nadie le avisó al adaptador de esta; la vista tradicional no observa los datos, muestra la última foto que alguien le ordenó sacar.</w:t>
+        <w:t>4.2: se agregó un botón de favorito en la pantalla de detalle. Para verificar su efecto se accedió al detalle de Google Maps, se la marcó como favorita y se regresó a la lista. La fila continuó mostrando el ícono vacío: el dato se modificó en otra pantalla y el adaptador de la lista no fue notificado. En el modelo tradicional la vista no observa los datos, sino que muestra el último estado que se le indicó dibujar.</w:t>
       </w:r>
     </w:p>
     <w:p>
@@ -1193,7 +1193,7 @@
           <w:color w:val="000000"/>
           <w:sz w:val="22"/>
         </w:rPr>
-        <w:t>Captura 3: WhatsApp marcada desde la lista (4.1); Google Maps marcada desde el detalle (4.2); al volver, la fila de Google Maps sigue vacía: lista desactualizada.</w:t>
+        <w:t>Captura 3: WhatsApp marcada desde la lista (4.1); Google Maps marcada desde el detalle (4.2); al regresar, la fila de Google Maps no refleja el cambio.</w:t>
       </w:r>
     </w:p>
     <w:p>
@@ -1204,7 +1204,7 @@
           <w:color w:val="000000"/>
           <w:sz w:val="24"/>
         </w:rPr>
-        <w:t>4.3, el parche del sincronizador: se agregó onResume() con un redibujado total "por si algo cambió mientras no miraba". Repitiendo el experimento, la fila ya aparece con estrella. Funciona, pero es un redibujado por las dudas: con veinte pantallas sería un campo minado de avisos cruzados.</w:t>
+        <w:t>4.3: como corrección se sobrescribió onResume() para redibujar la lista completa cada vez que la pantalla vuelve a primer plano. Al repetir la prueba, la fila se muestra actualizada. La solución es funcional, pero redibuja la lista aunque no haya cambios y obliga a que cada pantalla contemple las modificaciones realizadas por las demás, lo que no escala en aplicaciones con muchas pantallas.</w:t>
       </w:r>
     </w:p>
     <w:p>
@@ -1215,7 +1215,7 @@
           <w:color w:val="000000"/>
           <w:sz w:val="24"/>
         </w:rPr>
-        <w:t>4.4, buscador y "Solo favoritas": los listeners solo cambian su parte del estado y llaman a una única función central, aplicarFiltros(), que deriva la lista visible y el texto del botón desde el estado actual.</w:t>
+        <w:t>4.4: se incorporaron el campo de búsqueda y el botón "Solo favoritas". Cada listener modifica únicamente la parte del estado que le corresponde e invoca una función central, aplicarFiltros(), que calcula la lista visible y el texto del botón a partir del estado completo.</w:t>
       </w:r>
     </w:p>
     <w:p>
@@ -1339,7 +1339,7 @@
           <w:color w:val="000000"/>
           <w:sz w:val="22"/>
         </w:rPr>
-        <w:t>Captura 4: con el parche, Google Maps aparece marcada al volver (4.3); la búsqueda "go" achica la lista en vivo; búsqueda y modo favoritas combinados.</w:t>
+        <w:t>Captura 4: con la corrección, Google Maps aparece marcada al regresar (4.3); la búsqueda "go" filtra la lista; búsqueda y modo favoritas combinados.</w:t>
       </w:r>
     </w:p>
     <w:p>
@@ -1426,7 +1426,7 @@
           <w:color w:val="000000"/>
           <w:sz w:val="22"/>
         </w:rPr>
-        <w:t>Captura 5: modo favoritas con WhatsApp, Reddit y Google Maps; al desmarcar Reddit desaparece al instante.</w:t>
+        <w:t>Captura 5: modo favoritas con WhatsApp, Reddit y Google Maps; al desmarcar Reddit, la aplicación deja de mostrarse.</w:t>
       </w:r>
     </w:p>
     <w:p>
@@ -1437,7 +1437,7 @@
           <w:color w:val="000000"/>
           <w:sz w:val="24"/>
         </w:rPr>
-        <w:t>El estado que administra esta pantalla: el texto del buscador (vive en el EditText), el booleano soloFavoritas (variable de la Activity), los favoritos de cada app (en Catalogo) y la lista derivada de los tres.</w:t>
+        <w:t>El estado administrado por esta pantalla se compone del texto de búsqueda (almacenado en el EditText), la variable soloFavoritas (propiedad de la Activity), el atributo esFavorita de cada aplicación (almacenado en Catalogo) y la lista visible, que se deriva de los tres anteriores.</w:t>
       </w:r>
     </w:p>
     <w:p>
@@ -1451,7 +1451,7 @@
           <w:color w:val="000000"/>
           <w:sz w:val="32"/>
         </w:rPr>
-        <w:t>Etapa 5 - El giro fatal, version app real</w:t>
+        <w:t>Etapa 5 - Rotación y terminación del proceso</w:t>
       </w:r>
     </w:p>
     <w:p>
@@ -1462,7 +1462,7 @@
           <w:color w:val="000000"/>
           <w:sz w:val="24"/>
         </w:rPr>
-        <w:t>5.1: con WhatsApp, Reddit y Google Maps marcadas y el modo "Solo favoritas" activo, se rotó el dispositivo. El modo volvió a "Todas" y la lista mostró el catálogo completo, sin error ni crash. soloFavoritas era una variable de la Activity que el giro destruyó; la Activity nueva nació con false y aplicarFiltros() hizo su trabajo con el estado equivocado.</w:t>
+        <w:t>5.1: con WhatsApp, Reddit y Google Maps marcadas y el modo "Solo favoritas" activo, se rotó el dispositivo. El modo volvió a "Todas" y la lista mostró el catálogo completo, sin errores ni cierre de la aplicación. La variable soloFavoritas pertenecía a la Activity, que el sistema destruye y vuelve a crear al rotar; la nueva instancia se inicializó con el valor false y aplicarFiltros() calculó la lista con ese valor.</w:t>
       </w:r>
     </w:p>
     <w:p>
@@ -1549,7 +1549,7 @@
           <w:color w:val="000000"/>
           <w:sz w:val="22"/>
         </w:rPr>
-        <w:t>Captura 6: antes del giro, modo favoritas activo; después del giro, el modo se apagó solo.</w:t>
+        <w:t>Captura 6: antes de la rotación, modo favoritas activo; después, el modo se desactivó.</w:t>
       </w:r>
     </w:p>
     <w:p>
@@ -1596,7 +1596,7 @@
           <w:color w:val="000000"/>
           <w:sz w:val="22"/>
         </w:rPr>
-        <w:t>Captura 7: Logcat del giro: la Activity se destruye y se vuelve a crear.</w:t>
+        <w:t>Captura 7: Logcat durante la rotación: la Activity se destruye y se vuelve a crear.</w:t>
       </w:r>
     </w:p>
     <w:p>
@@ -1607,7 +1607,7 @@
           <w:color w:val="000000"/>
           <w:sz w:val="24"/>
         </w:rPr>
-        <w:t xml:space="preserve">5.2: los favoritos sobrevivieron al giro porque viven en el singleton, que es memoria del proceso. Con favoritas marcadas, Home, </w:t>
+        <w:t xml:space="preserve">5.2: los favoritos sobrevivieron a la rotación porque se almacenan en el singleton, que reside en la memoria del proceso. Se marcaron favoritas, se envió la aplicación a segundo plano, se ejecutó </w:t>
       </w:r>
       <w:r>
         <w:rPr>
@@ -1625,7 +1625,7 @@
           <w:color w:val="000000"/>
           <w:sz w:val="24"/>
         </w:rPr>
-        <w:t xml:space="preserve"> y vuelta desde recientes, las estrellas quedaron en blanco: el proceso murió (PID nuevo) y el singleton con él.</w:t>
+        <w:t xml:space="preserve"> y se retomó desde la pantalla de aplicaciones recientes. Todos los favoritos se perdieron: el proceso finalizó (nuevo PID) y con él el singleton.</w:t>
       </w:r>
     </w:p>
     <w:p>
@@ -1712,7 +1712,7 @@
           <w:color w:val="000000"/>
           <w:sz w:val="22"/>
         </w:rPr>
-        <w:t>Captura 8: volviendo desde recientes; proceso nuevo con todos los favoritos en blanco.</w:t>
+        <w:t>Captura 8: retorno desde aplicaciones recientes; nuevo proceso sin favoritos.</w:t>
       </w:r>
     </w:p>
     <w:p>
@@ -1759,7 +1759,7 @@
           <w:color w:val="000000"/>
           <w:sz w:val="22"/>
         </w:rPr>
-        <w:t>Captura 9: Logcat tras el kill: PID 23478 reemplazado por 24858.</w:t>
+        <w:t>Captura 9: Logcat posterior a la terminación: el PID 23478 fue reemplazado por el 24858.</w:t>
       </w:r>
     </w:p>
     <w:p>
@@ -1770,7 +1770,7 @@
           <w:color w:val="000000"/>
           <w:sz w:val="24"/>
         </w:rPr>
-        <w:t>Problemas encontrados: con targetSdk 36 las apps se dibujan edge-to-edge y la lista quedaba debajo de la barra de estado, así que se agregó android:fitsSystemWindows="true" a los layouts raíz. En el detalle ese atributo reemplaza el padding, por lo que se cambió android:padding="24dp" por android:layout_margin="24dp".</w:t>
+        <w:t>Problemas encontrados: con targetSdk 36 las aplicaciones se dibujan de borde a borde (edge-to-edge) y la lista quedaba debajo de la barra de estado; se resolvió agregando android:fitsSystemWindows="true" a los layouts raíz. En la pantalla de detalle ese atributo reemplaza el padding, por lo que android:padding="24dp" se sustituyó por android:layout_margin="24dp".</w:t>
       </w:r>
     </w:p>
     <w:p>
@@ -1784,7 +1784,7 @@
           <w:color w:val="000000"/>
           <w:sz w:val="32"/>
         </w:rPr>
-        <w:t>Desafios opcionales 3A</w:t>
+        <w:t>Desafíos opcionales 3A</w:t>
       </w:r>
     </w:p>
     <w:p>
@@ -1798,7 +1798,7 @@
           <w:color w:val="000000"/>
           <w:sz w:val="26"/>
         </w:rPr>
-        <w:t>1. El martillo fino: DiffUtil</w:t>
+        <w:t>1. DiffUtil</w:t>
       </w:r>
     </w:p>
     <w:p>
@@ -1809,7 +1809,7 @@
           <w:color w:val="000000"/>
           <w:sz w:val="24"/>
         </w:rPr>
-        <w:t>AppAdapter pasó a ser un ListAdapter con un DiffUtil.ItemCallback: areItemsTheSame compara ids y areContentsTheSame compara los datos. El primer intento, submitList(nueva), rompió la estrella: se tocaba y no cambiaba. La causa es justamente lo que el lab pedía anotar en la Etapa 1: la app se muta en el lugar, así que DiffUtil compara cada objeto consigo mismo y concluye que nada cambió. La solución fue enviar copias al adaptador (submitList(nueva.map { it.copy() })) y resolver la app real por id en las lambdas. Es la misma lección que 3C convierte en regla: la inmutabilidad.</w:t>
+        <w:t>AppAdapter se convirtió en un ListAdapter con un DiffUtil.ItemCallback: areItemsTheSame compara identificadores y areContentsTheSame compara el contenido. La primera implementación, submitList(nueva), impidió que el ícono de favorito se actualizara. La causa es que las aplicaciones se modifican sobre el mismo objeto: DiffUtil compara cada instancia consigo misma y concluye que no hubo cambios. Se resolvió enviando copias al adaptador (submitList(nueva.map { it.copy() })) y obteniendo la aplicación original por su identificador en las funciones lambda. Este resultado anticipa el criterio que 3C adopta como norma: la inmutabilidad del estado.</w:t>
       </w:r>
     </w:p>
     <w:p>
@@ -1834,7 +1834,7 @@
           <w:color w:val="000000"/>
           <w:sz w:val="24"/>
         </w:rPr>
-        <w:t>Se agregó una línea al final de aplicarFiltros(): lista.sortedByDescending { it.esFavorita }. Como el orden es estable, dentro de cada grupo se respeta el orden del catálogo. Es otro estado derivado más que se combina con la búsqueda y el modo; sin función central habría que acordarse de ordenar en cada listener.</w:t>
+        <w:t>Se agregó al final de aplicarFiltros() la instrucción lista.sortedByDescending { it.esFavorita }. Dado que el ordenamiento es estable, dentro de cada grupo se conserva el orden del catálogo. El orden constituye un estado derivado adicional que se combina con la búsqueda y el modo; sin una función central, sería necesario aplicarlo en cada listener.</w:t>
       </w:r>
     </w:p>
     <w:p>
@@ -1958,7 +1958,7 @@
           <w:color w:val="000000"/>
           <w:sz w:val="22"/>
         </w:rPr>
-        <w:t>Captura 10: con submitList ingenuo la estrella de WhatsApp no cambia; con copias, YouTube se marca y sube primera; con GitHub marcada, las dos favoritas quedan arriba.</w:t>
+        <w:t>Captura 10: con la primera implementación el ícono de WhatsApp no cambia; con copias, YouTube se marca y pasa al primer lugar; con GitHub marcada, ambas favoritas encabezan la lista.</w:t>
       </w:r>
     </w:p>
     <w:p>
@@ -1972,7 +1972,7 @@
           <w:color w:val="000000"/>
           <w:sz w:val="26"/>
         </w:rPr>
-        <w:t>3. El rescate manual</w:t>
+        <w:t>3. Restauración manual del estado</w:t>
       </w:r>
     </w:p>
     <w:p>
@@ -1983,7 +1983,7 @@
           <w:color w:val="000000"/>
           <w:sz w:val="24"/>
         </w:rPr>
-        <w:t>soloFavoritas se guarda en onSaveInstanceState y se restaura en onCreate. Ahora el giro no apaga el modo. Además, el Bundle guardado sobrevive a la muerte del proceso: tras el kill el modo sigue activo, pero la lista queda vacía porque los favoritos murieron con el singleton. Funciona, y es exactamente el rescate a mano, variable por variable, que 3B viene a jubilar.</w:t>
+        <w:t>La variable soloFavoritas se guarda en onSaveInstanceState y se recupera en onCreate. Con este cambio, la rotación ya no desactiva el modo. Además, el Bundle guardado se conserva ante la terminación del proceso: el modo continúa activo, pero la lista queda vacía porque los favoritos se perdieron junto con el singleton. La técnica es efectiva, pero requiere guardar y restaurar cada variable de forma manual, que es precisamente lo que 3B reemplaza.</w:t>
       </w:r>
     </w:p>
     <w:p>
@@ -2107,7 +2107,7 @@
           <w:color w:val="000000"/>
           <w:sz w:val="22"/>
         </w:rPr>
-        <w:t>Captura 11: modo favoritas antes del giro; después del giro el modo sigue activo; tras el kill el modo sobrevive pero no quedan favoritas.</w:t>
+        <w:t>Captura 11: modo favoritas antes de la rotación; después de la rotación el modo se mantiene; tras la terminación del proceso el modo se mantiene pero no quedan favoritas.</w:t>
       </w:r>
     </w:p>
     <w:p>
@@ -2132,7 +2132,7 @@
           <w:color w:val="000000"/>
           <w:sz w:val="24"/>
         </w:rPr>
-        <w:t>No se creó un proyecto nuevo: se copió AppTeca del 3A (con sus desafíos) a Lab3B y se refactorizó. Para el usuario la app hace exactamente lo mismo; el cambio es interno. El rescate manual del desafío 3 se eliminó: ese es el trabajo que el ViewModel hace ahora.</w:t>
+        <w:t>No se creó un proyecto nuevo: se copió AppTeca del 3A, incluidos sus desafíos, a la carpeta Lab3B y se refactorizó. El comportamiento visible para el usuario se mantiene sin cambios; la modificación es interna. La restauración manual del desafío 3 se eliminó, ya que esa responsabilidad pasa al ViewModel.</w:t>
       </w:r>
     </w:p>
     <w:p>
@@ -2146,7 +2146,7 @@
           <w:color w:val="000000"/>
           <w:sz w:val="32"/>
         </w:rPr>
-        <w:t>Etapa 1 - El plano de la mudanza</w:t>
+        <w:t>Etapa 1 - Análisis del estado</w:t>
       </w:r>
     </w:p>
     <w:tbl>
@@ -2190,7 +2190,7 @@
                 <w:b/>
                 <w:sz w:val="22"/>
               </w:rPr>
-              <w:t>Donde vive hoy</w:t>
+              <w:t>Dónde vive</w:t>
             </w:r>
           </w:p>
         </w:tc>
@@ -2206,7 +2206,7 @@
                 <w:b/>
                 <w:sz w:val="22"/>
               </w:rPr>
-              <w:t>Sobrevivio al giro</w:t>
+              <w:t>Rotación</w:t>
             </w:r>
           </w:p>
         </w:tc>
@@ -2222,7 +2222,7 @@
                 <w:b/>
                 <w:sz w:val="22"/>
               </w:rPr>
-              <w:t>A la muerte del proceso</w:t>
+              <w:t>Terminación del proceso</w:t>
             </w:r>
           </w:p>
         </w:tc>
@@ -2258,7 +2258,7 @@
                 <w:color w:val="000000"/>
                 <w:sz w:val="20"/>
               </w:rPr>
-              <w:t>En el EditText (vista con id)</w:t>
+              <w:t>EditText (vista con id)</w:t>
             </w:r>
           </w:p>
         </w:tc>
@@ -2275,7 +2275,7 @@
                 <w:color w:val="000000"/>
                 <w:sz w:val="20"/>
               </w:rPr>
-              <w:t>Sí, el sistema restaura las vistas con id</w:t>
+              <w:t>Se conserva: el sistema restaura las vistas con id</w:t>
             </w:r>
           </w:p>
         </w:tc>
@@ -2292,7 +2292,7 @@
                 <w:color w:val="000000"/>
                 <w:sz w:val="20"/>
               </w:rPr>
-              <w:t>Sí, viaja en el estado guardado por el sistema</w:t>
+              <w:t>Se conserva: forma parte del estado guardado por el sistema</w:t>
             </w:r>
           </w:p>
         </w:tc>
@@ -2345,7 +2345,7 @@
                 <w:color w:val="000000"/>
                 <w:sz w:val="20"/>
               </w:rPr>
-              <w:t>No, murió con la Activity (bug 5.1)</w:t>
+              <w:t>Se pierde junto con la Activity (error 5.1)</w:t>
             </w:r>
           </w:p>
         </w:tc>
@@ -2362,7 +2362,7 @@
                 <w:color w:val="000000"/>
                 <w:sz w:val="20"/>
               </w:rPr>
-              <w:t>No</w:t>
+              <w:t>Se pierde</w:t>
             </w:r>
           </w:p>
         </w:tc>
@@ -2415,7 +2415,7 @@
                 <w:color w:val="000000"/>
                 <w:sz w:val="20"/>
               </w:rPr>
-              <w:t>Sí, el giro no mata el proceso</w:t>
+              <w:t>Se conserva: la rotación no finaliza el proceso</w:t>
             </w:r>
           </w:p>
         </w:tc>
@@ -2432,7 +2432,7 @@
                 <w:color w:val="000000"/>
                 <w:sz w:val="20"/>
               </w:rPr>
-              <w:t>No, murieron con el proceso</w:t>
+              <w:t>Se pierde junto con el proceso</w:t>
             </w:r>
           </w:p>
         </w:tc>
@@ -2468,7 +2468,7 @@
                 <w:color w:val="000000"/>
                 <w:sz w:val="20"/>
               </w:rPr>
-              <w:t>En ningún lado, se recalcula</w:t>
+              <w:t>No se almacena: se recalcula</w:t>
             </w:r>
           </w:p>
         </w:tc>
@@ -2485,7 +2485,7 @@
                 <w:color w:val="000000"/>
                 <w:sz w:val="20"/>
               </w:rPr>
-              <w:t>Se recalcula (con el modo equivocado)</w:t>
+              <w:t>Se recalcula (con el modo incorrecto)</w:t>
             </w:r>
           </w:p>
         </w:tc>
@@ -2502,7 +2502,7 @@
                 <w:color w:val="000000"/>
                 <w:sz w:val="20"/>
               </w:rPr>
-              <w:t>Se recalcula desde cero</w:t>
+              <w:t>Se recalcula desde el inicio</w:t>
             </w:r>
           </w:p>
         </w:tc>
@@ -2517,7 +2517,7 @@
           <w:color w:val="000000"/>
           <w:sz w:val="24"/>
         </w:rPr>
-        <w:t>El plano: al ViewModel se mudan soloFavoritas, la copia de trabajo de la búsqueda, la lista visible (que pasa a publicarse) y aplicarFiltros() entera, que es lógica de presentación. Quedan donde están los layouts, el adaptador, la navegación por Intent y Catalogo.</w:t>
+        <w:t>A partir del análisis se decidió trasladar al ViewModel la variable soloFavoritas, la copia de trabajo de la búsqueda, la lista visible (que pasa a publicarse) y la función aplicarFiltros(), por tratarse de lógica de presentación. Los layouts, el adaptador, la navegación mediante Intents y Catalogo permanecen sin cambios.</w:t>
       </w:r>
     </w:p>
     <w:p>
@@ -2531,7 +2531,7 @@
           <w:color w:val="000000"/>
           <w:sz w:val="32"/>
         </w:rPr>
-        <w:t>Etapa 2 - Los cimientos: el ViewModel existe y sobrevive</w:t>
+        <w:t>Etapa 2 - Incorporación del ViewModel</w:t>
       </w:r>
     </w:p>
     <w:p>
@@ -2542,7 +2542,7 @@
           <w:color w:val="000000"/>
           <w:sz w:val="24"/>
         </w:rPr>
-        <w:t xml:space="preserve">Se agregaron activity-ktx 1.9.3, lifecycle-viewmodel-ktx 2.8.7 y lifecycle-livedata-ktx 2.8.7, y un AppTecaViewModel vacío con logs de nacimiento (con su hashCode) y de onCleared. En MainActivity: </w:t>
+        <w:t xml:space="preserve">Se agregaron las dependencias activity-ktx 1.9.3, lifecycle-viewmodel-ktx 2.8.7 y lifecycle-livedata-ktx 2.8.7, y una clase AppTecaViewModel vacía con registros de creación (incluyendo su hashCode) y de onCleared. En MainActivity se declaró </w:t>
       </w:r>
       <w:r>
         <w:rPr>
@@ -2560,7 +2560,7 @@
           <w:color w:val="000000"/>
           <w:sz w:val="24"/>
         </w:rPr>
-        <w:t>. No se construye: se le pide la instancia al sistema, que la crea la primera vez y la devuelve viva cuando la Activity se recrea.</w:t>
+        <w:t>. La instancia no se construye directamente, sino que se solicita al sistema, que la crea la primera vez y devuelve la misma instancia cuando la Activity se recrea.</w:t>
       </w:r>
     </w:p>
     <w:p>
@@ -2607,7 +2607,7 @@
           <w:color w:val="000000"/>
           <w:sz w:val="22"/>
         </w:rPr>
-        <w:t>Captura 12: Logcat al abrir, girar dos veces y salir con atrás: un único "ViewModel → creado (143462228)"; onCleared aparece recién al salir.</w:t>
+        <w:t>Captura 12: Logcat al abrir la aplicación, rotar dos veces y salir con el botón atrás: se registra una única creación del ViewModel (143462228) y onCleared solo al salir.</w:t>
       </w:r>
     </w:p>
     <w:p>
@@ -2621,7 +2621,7 @@
           <w:color w:val="000000"/>
           <w:sz w:val="32"/>
         </w:rPr>
-        <w:t>Etapa 3 - La mudanza: el estado y su logica se van al ViewModel</w:t>
+        <w:t>Etapa 3 - Traslado del estado y la lógica al ViewModel</w:t>
       </w:r>
     </w:p>
     <w:p>
@@ -2632,7 +2632,7 @@
           <w:color w:val="000000"/>
           <w:sz w:val="24"/>
         </w:rPr>
-        <w:t>El ViewModel guarda query y soloFavoritas y publica listaVisible y modoSoloFavoritas como LiveData (par privado mutable y público de solo lectura). Los eventos suben como llamadas: buscar, alternarModo, alternarFavorita. aplicarFiltros() es la misma función del 3A pero ya no toca vistas: publica. La clase no importa nada de la interfaz de Android.</w:t>
+        <w:t>El ViewModel almacena query y soloFavoritas y publica listaVisible y modoSoloFavoritas como LiveData, con una propiedad privada mutable y una pública de solo lectura. Los eventos de la interfaz se comunican mediante llamadas a métodos: buscar, alternarModo y alternarFavorita. aplicarFiltros() mantiene la lógica del 3A, pero ya no modifica vistas: publica el resultado. La clase no depende de ningún componente de la interfaz de Android.</w:t>
       </w:r>
     </w:p>
     <w:p>
@@ -2646,7 +2646,7 @@
           <w:color w:val="000000"/>
           <w:sz w:val="32"/>
         </w:rPr>
-        <w:t>Etapa 4 - La suscripcion: el sincronizador se jubila</w:t>
+        <w:t>Etapa 4 - Suscripción de la Activity</w:t>
       </w:r>
     </w:p>
     <w:p>
@@ -2657,7 +2657,7 @@
           <w:color w:val="000000"/>
           <w:sz w:val="24"/>
         </w:rPr>
-        <w:t>La Activity quedó reducida a mostrar, escuchar y avisar: cada listener es una línea que avisa al ViewModel y el estado baja por dos suscripciones observe. Se eliminó el onResume "por si algo cambió mientras no miraba".</w:t>
+        <w:t>La Activity quedó limitada a mostrar datos, recibir eventos y notificarlos: cada listener consiste en una llamada al ViewModel y el estado se recibe mediante dos suscripciones con observe. Se eliminó la sobrescritura de onResume incorporada en la etapa 4.3 del 3A.</w:t>
       </w:r>
     </w:p>
     <w:p>
@@ -2707,7 +2707,7 @@
           <w:color w:val="000000"/>
           <w:sz w:val="22"/>
         </w:rPr>
-        <w:t>Captura 13: AppTeca refactorizada funcionando igual que en 3A.</w:t>
+        <w:t>Captura 13: AppTeca refactorizada, con el mismo comportamiento que en 3A.</w:t>
       </w:r>
     </w:p>
     <w:p>
@@ -2721,7 +2721,7 @@
           <w:color w:val="000000"/>
           <w:sz w:val="32"/>
         </w:rPr>
-        <w:t>Etapa 5 - La prueba de fuego</w:t>
+        <w:t>Etapa 5 - Verificación</w:t>
       </w:r>
     </w:p>
     <w:p>
@@ -2732,7 +2732,7 @@
           <w:color w:val="000000"/>
           <w:sz w:val="24"/>
         </w:rPr>
-        <w:t>5.1, el giro: WhatsApp, Reddit y Google Maps marcadas, búsqueda "d" y modo favoritas activo (queda solo Reddit). Después del giro todo siguió igual.</w:t>
+        <w:t>5.1: con WhatsApp, Reddit y Google Maps marcadas, la búsqueda "d" y el modo favoritas activo (resultado: Reddit), se rotó el dispositivo. El estado completo se mantuvo.</w:t>
       </w:r>
     </w:p>
     <w:p>
@@ -2819,7 +2819,7 @@
           <w:color w:val="000000"/>
           <w:sz w:val="22"/>
         </w:rPr>
-        <w:t>Captura 14: búsqueda y modo antes del giro; después del giro, todo sobrevive.</w:t>
+        <w:t>Captura 14: búsqueda y modo antes de la rotación; después, el estado se conserva.</w:t>
       </w:r>
     </w:p>
     <w:p>
@@ -2866,7 +2866,7 @@
           <w:color w:val="000000"/>
           <w:sz w:val="22"/>
         </w:rPr>
-        <w:t>Captura 15: Logcat del giro: la Activity muere y renace, pero no aparece un "ViewModel → creado" nuevo.</w:t>
+        <w:t>Captura 15: Logcat durante la rotación: la Activity se recrea, pero no se registra la creación de un nuevo ViewModel.</w:t>
       </w:r>
     </w:p>
     <w:p>
@@ -2877,7 +2877,7 @@
           <w:color w:val="000000"/>
           <w:sz w:val="24"/>
         </w:rPr>
-        <w:t>La Activity recién nacida, al suscribirse, recibió el último valor publicado. El bug del 3A no se arregló: se volvió imposible de escribir.</w:t>
+        <w:t>Al suscribirse, la nueva Activity recibió el último valor publicado. El error del 3A no requirió una corrección puntual: la nueva arquitectura impide que se produzca.</w:t>
       </w:r>
     </w:p>
     <w:p>
@@ -2888,7 +2888,7 @@
           <w:color w:val="000000"/>
           <w:sz w:val="24"/>
         </w:rPr>
-        <w:t xml:space="preserve">5.2, el límite: modo activo, Home, </w:t>
+        <w:t xml:space="preserve">5.2: con el modo activo, se envió la aplicación a segundo plano, se ejecutó </w:t>
       </w:r>
       <w:r>
         <w:rPr>
@@ -2906,7 +2906,7 @@
           <w:color w:val="000000"/>
           <w:sz w:val="24"/>
         </w:rPr>
-        <w:t xml:space="preserve"> y vuelta desde recientes. Modo apagado y favoritos en blanco: el ViewModel también murió (nuevo hashCode). El texto "d" volvió porque el EditText lo restaura, y como eso ocurre después de registrar el TextWatcher, el listener avisó al ViewModel y la lista quedó filtrada.</w:t>
+        <w:t xml:space="preserve"> y se retomó desde recientes. El modo se desactivó y los favoritos se perdieron: el ViewModel también finalizó (nuevo hashCode). El texto "d" se restauró porque el EditText forma parte del estado guardado por el sistema; como la restauración ocurre después de registrar el TextWatcher, el listener notificó al ViewModel y la lista quedó filtrada.</w:t>
       </w:r>
     </w:p>
     <w:p>
@@ -2956,7 +2956,7 @@
           <w:color w:val="000000"/>
           <w:sz w:val="22"/>
         </w:rPr>
-        <w:t>Captura 16: después del kill: texto "d" restaurado, lista filtrada, sin favoritas y con el modo apagado.</w:t>
+        <w:t>Captura 16: después de la terminación del proceso: texto "d" restaurado, lista filtrada, sin favoritas y con el modo desactivado.</w:t>
       </w:r>
     </w:p>
     <w:p>
@@ -3003,7 +3003,7 @@
           <w:color w:val="000000"/>
           <w:sz w:val="22"/>
         </w:rPr>
-        <w:t>Captura 17: Logcat tras el kill: PID nuevo y un ViewModel nuevo (82103975).</w:t>
+        <w:t>Captura 17: Logcat posterior a la terminación: nuevo PID y nueva instancia del ViewModel (82103975).</w:t>
       </w:r>
     </w:p>
     <w:p>
@@ -3014,7 +3014,7 @@
           <w:color w:val="000000"/>
           <w:sz w:val="24"/>
         </w:rPr>
-        <w:t xml:space="preserve">5.3, la grieta revisitada: sin el parche, marcar YouTube desde el detalle volvió a dejar la lista desactualizada. No es un problema de supervivencia sino de fuente de verdad: DetalleActivity muta el Catalogo por afuera y el ViewModel no tiene forma de enterarse. Se aplicó el parche pragmático, </w:t>
+        <w:t xml:space="preserve">5.3: sin la corrección de onResume, marcar YouTube desde el detalle volvió a dejar la lista desactualizada. No se trata de un problema de persistencia del estado sino de la fuente de verdad: DetalleActivity modifica Catalogo directamente y el ViewModel no tiene forma de detectarlo. Se aplicó la corrección propuesta, </w:t>
       </w:r>
       <w:r>
         <w:rPr>
@@ -3032,7 +3032,7 @@
           <w:color w:val="000000"/>
           <w:sz w:val="24"/>
         </w:rPr>
-        <w:t>, que no redibuja por las dudas sino que le pide a la fuente que vuelva a derivar.</w:t>
+        <w:t>, que en lugar de redibujar la lista solicita al ViewModel que vuelva a calcularla desde la fuente de datos.</w:t>
       </w:r>
     </w:p>
     <w:p>
@@ -3156,7 +3156,7 @@
           <w:color w:val="000000"/>
           <w:sz w:val="22"/>
         </w:rPr>
-        <w:t>Captura 18: YouTube marcada desde el detalle; sin parche la lista no se entera; con vm.refrescar() YouTube aparece marcada y primera.</w:t>
+        <w:t>Captura 18: YouTube marcada desde el detalle; sin la corrección, la lista no se actualiza; con vm.refrescar(), YouTube aparece marcada y en primer lugar.</w:t>
       </w:r>
     </w:p>
     <w:p>
@@ -3170,7 +3170,7 @@
           <w:color w:val="000000"/>
           <w:sz w:val="32"/>
         </w:rPr>
-        <w:t>Desafios opcionales 3B</w:t>
+        <w:t>Desafíos opcionales 3B</w:t>
       </w:r>
     </w:p>
     <w:p>
@@ -3184,7 +3184,7 @@
           <w:color w:val="000000"/>
           <w:sz w:val="26"/>
         </w:rPr>
-        <w:t>1. El test que ayer era imposible</w:t>
+        <w:t>1. Pruebas unitarias del ViewModel</w:t>
       </w:r>
     </w:p>
     <w:p>
@@ -3195,7 +3195,7 @@
           <w:color w:val="000000"/>
           <w:sz w:val="24"/>
         </w:rPr>
-        <w:t>AppTecaViewModelTest (JUnit 4, en src/test) instancia el ViewModel sin emulador, simula búsquedas, estrellas y alternancias, y afirma sobre listaVisible.value. Hicieron falta tres cosas: InstantTaskExecutorRule, porque LiveData exige el hilo principal y la regla ejecuta todo sincrónicamente; un @Before que resetea Catalogo, porque el singleton se comparte entre tests; y testOptions.unitTests.isReturnDefaultValues = true, porque el Log.d del init no existe en la JVM (el primer intento falló con "Method d in android.util.Log not mocked").</w:t>
+        <w:t>Se implementó AppTecaViewModelTest (JUnit 4, en src/test), que instancia el ViewModel sin emulador, simula búsquedas, cambios de favoritos y cambios de modo, y verifica el valor de listaVisible. Fueron necesarios tres ajustes: InstantTaskExecutorRule, porque LiveData requiere el hilo principal y la regla ejecuta las operaciones de forma sincrónica; un método @Before que restablece Catalogo, porque el singleton se comparte entre pruebas; y la opción testOptions.unitTests.isReturnDefaultValues = true, porque la llamada a Log.d del bloque init no está disponible en la JVM (la primera ejecución falló con el error "Method d in android.util.Log not mocked").</w:t>
       </w:r>
     </w:p>
     <w:p>
@@ -3242,7 +3242,7 @@
           <w:color w:val="000000"/>
           <w:sz w:val="22"/>
         </w:rPr>
-        <w:t>Captura 19: Resultado: 6 tests, 0 fallos.</w:t>
+        <w:t>Captura 19: resultado de la ejecución: 6 pruebas, 0 fallos.</w:t>
       </w:r>
     </w:p>
     <w:p>
@@ -3256,7 +3256,7 @@
           <w:color w:val="000000"/>
           <w:sz w:val="26"/>
         </w:rPr>
-        <w:t>2. Sobrevivir tambien al proceso: SavedStateHandle</w:t>
+        <w:t>2. Persistencia ante la terminación del proceso: SavedStateHandle</w:t>
       </w:r>
     </w:p>
     <w:p>
@@ -3267,7 +3267,7 @@
           <w:color w:val="000000"/>
           <w:sz w:val="24"/>
         </w:rPr>
-        <w:t>El constructor pasó a ser AppTecaViewModel(private val state: SavedStateHandle), y query y soloFavoritas se leen y escriben en el handle; by viewModels() ya sabe entregarlo. Se repitió el experimento 5.2 con WhatsApp y Discord marcadas, búsqueda "o" y modo activo: tras el kill, el modo y la búsqueda sobrevivieron, pero la lista quedó vacía porque los favoritos son datos, no estado de pantalla, y murieron con el proceso. Cada cosa tiene su defensa: SavedStateHandle para el estado chico y persistencia real para los datos.</w:t>
+        <w:t>El constructor se modificó a AppTecaViewModel(private val state: SavedStateHandle), y query y soloFavoritas se leen y escriben en ese objeto; by viewModels() lo provee sin configuración adicional. Se repitió la prueba 5.2 con WhatsApp y Discord marcadas, la búsqueda "o" y el modo activo. Tras la terminación del proceso se conservaron el modo y la búsqueda, pero la lista quedó vacía: los favoritos son datos de la aplicación, no estado de la pantalla, y se perdieron con el proceso. Cada tipo de información requiere su propio mecanismo: SavedStateHandle para el estado de la pantalla y almacenamiento persistente para los datos.</w:t>
       </w:r>
     </w:p>
     <w:p>
@@ -3354,7 +3354,7 @@
           <w:color w:val="000000"/>
           <w:sz w:val="22"/>
         </w:rPr>
-        <w:t>Captura 20: antes del kill, búsqueda "o" y modo favoritas; después, el modo y la búsqueda sobreviven y los favoritos no.</w:t>
+        <w:t>Captura 20: antes de la terminación, búsqueda "o" y modo favoritas; después, se conservan el modo y la búsqueda, pero no los favoritos.</w:t>
       </w:r>
     </w:p>
     <w:p>
@@ -3401,7 +3401,7 @@
           <w:color w:val="000000"/>
           <w:sz w:val="22"/>
         </w:rPr>
-        <w:t>Captura 21: Logcat del experimento con SavedStateHandle.</w:t>
+        <w:t>Captura 21: Logcat de la prueba con SavedStateHandle.</w:t>
       </w:r>
     </w:p>
     <w:p>
@@ -3415,7 +3415,7 @@
           <w:color w:val="000000"/>
           <w:sz w:val="26"/>
         </w:rPr>
-        <w:t>3. La semilla de los Fragments</w:t>
+        <w:t>3. ViewModel compartido entre Fragments</w:t>
       </w:r>
     </w:p>
     <w:p>
@@ -3426,7 +3426,7 @@
           <w:color w:val="000000"/>
           <w:sz w:val="24"/>
         </w:rPr>
-        <w:t>Con activityViewModels(), dos Fragments hermanos dentro de la misma Activity reciben la misma instancia de ViewModel, porque el alcance es la Activity y no cada Fragment. Eso arreglaría la grieta del detalle: la lista y el detalle observarían el mismo estado y marcar una favorita en uno se vería en el otro sin parche. Con dos Activities no se puede, porque cada Activity es su propio ViewModelStoreOwner y by viewModels() le da a cada una su propio ViewModel. Es exactamente lo que 3C hace con una sola Activity y la navegación como estado.</w:t>
+        <w:t>Mediante activityViewModels(), dos Fragments de una misma Activity obtienen la misma instancia de ViewModel, ya que su alcance es la Activity y no cada Fragment. Esto resolvería el problema de la pantalla de detalle: la lista y el detalle observarían el mismo estado, y un cambio realizado en uno se reflejaría en el otro sin correcciones adicionales. Con dos Activities no es posible, porque cada Activity es un ViewModelStoreOwner independiente y by viewModels() asigna a cada una su propia instancia. 3C aplica este mismo principio con una única Activity y la navegación representada como estado.</w:t>
       </w:r>
     </w:p>
     <w:p>
@@ -3454,7 +3454,7 @@
           <w:color w:val="000000"/>
           <w:sz w:val="32"/>
         </w:rPr>
-        <w:t>Etapa 1 - El proyecto Compose: cerrar un circulo</w:t>
+        <w:t>Etapa 1 - Proyecto Compose</w:t>
       </w:r>
     </w:p>
     <w:p>
@@ -3465,7 +3465,7 @@
           <w:color w:val="000000"/>
           <w:sz w:val="24"/>
         </w:rPr>
-        <w:t>Se creó AppTeca3 con la plantilla Compose. No existe res &gt; layout: la carpeta res conserva strings, íconos y temas, pero la estructura de las pantallas vive en MainActivity.kt, dentro de setContent. Se copiaron App.kt y Catalogo.kt cambiando solo la línea package. Para compilar hizo falta el plugin org.jetbrains.kotlin.plugin.compose 2.2.10, que debe coincidir con el Kotlin que trae AGP 9.3.3.</w:t>
+        <w:t>Se creó el proyecto AppTeca3 a partir de la plantilla de Compose. El proyecto no contiene la carpeta res &gt; layout: res conserva los textos, íconos y temas, mientras que la estructura de las pantallas se define en MainActivity.kt, dentro de setContent. Se copiaron App.kt y Catalogo.kt modificando únicamente la declaración package. La compilación requirió el plugin org.jetbrains.kotlin.plugin.compose 2.2.10, cuya versión debe coincidir con la de Kotlin incluida en AGP 9.3.3.</w:t>
       </w:r>
     </w:p>
     <w:p>
@@ -3479,7 +3479,7 @@
           <w:color w:val="000000"/>
           <w:sz w:val="32"/>
         </w:rPr>
-        <w:t>Etapa 2 - La lista: la ceremonia que no vas a pagar</w:t>
+        <w:t>Etapa 2 - Lista con LazyColumn</w:t>
       </w:r>
     </w:p>
     <w:p>
@@ -3490,7 +3490,7 @@
           <w:color w:val="000000"/>
           <w:sz w:val="24"/>
         </w:rPr>
-        <w:t>FilaApp (un Row con una Column de peso 1 y la estrella clickeable) y ListaApps (un LazyColumn con items(apps, key = { it.id })). En 3A fueron cuatro piezas en dos archivos (~85 líneas); acá son dos funciones en un archivo (~40 líneas), sin ids ni findViewById.</w:t>
+        <w:t>Se implementaron las funciones FilaApp (un Row con una Column de peso 1 y el ícono de favorito) y ListaApps (una LazyColumn con items(apps, key = { it.id })). En 3A la lista requirió cuatro componentes en dos archivos (aproximadamente 85 líneas); en 3C requiere dos funciones en un único archivo (aproximadamente 40 líneas), sin identificadores de vista ni llamadas a findViewById.</w:t>
       </w:r>
     </w:p>
     <w:p>
@@ -3504,7 +3504,7 @@
           <w:color w:val="000000"/>
           <w:sz w:val="32"/>
         </w:rPr>
-        <w:t>Etapa 3 - El estado entra: tu ViewModel se muda, la pantalla se suscribe</w:t>
+        <w:t>Etapa 3 - Integración del ViewModel</w:t>
       </w:r>
     </w:p>
     <w:p>
@@ -3515,7 +3515,7 @@
           <w:color w:val="000000"/>
           <w:sz w:val="24"/>
         </w:rPr>
-        <w:t>Se sumaron lifecycle-viewmodel-compose y lifecycle-runtime-compose 2.8.7. El ViewModel del 3B se copió con un cambio: LiveData pasó a StateFlow. La diferencia grande está en alternarFavorita, que ya no muta esFavorita: arma una lista nueva con it.copy(...), porque Compose decide recomponer comparando estados. En consecuencia esFavorita pasó de var a val. La pantalla lee el estado con collectAsStateWithLifecycle() y el buscador es un componente controlado: el OutlinedTextField no guarda texto propio, muestra textoBusqueda y cada tecla dispara onValueChange. No se escribió ningún notify ni observe.</w:t>
+        <w:t>Se agregaron lifecycle-viewmodel-compose y lifecycle-runtime-compose 2.8.7. El ViewModel del 3B se reutilizó con un cambio: LiveData se reemplazó por StateFlow. La modificación más relevante se encuentra en alternarFavorita, que ya no modifica esFavorita sobre el objeto existente, sino que construye una lista nueva mediante it.copy(...), dado que Compose determina si debe recomponer comparando el estado anterior con el nuevo. En consecuencia, esFavorita se declaró como val. La pantalla obtiene el estado con collectAsStateWithLifecycle() y el campo de búsqueda es un componente controlado: el OutlinedTextField no almacena texto propio, sino que muestra el valor de textoBusqueda, y cada modificación invoca onValueChange. No fue necesario realizar notificaciones manuales ni suscripciones explícitas.</w:t>
       </w:r>
     </w:p>
     <w:p>
@@ -3639,7 +3639,7 @@
           <w:color w:val="000000"/>
           <w:sz w:val="22"/>
         </w:rPr>
-        <w:t>Captura 22: LazyColumn con las 8 apps; búsqueda "d"; búsqueda más modo favoritas.</w:t>
+        <w:t>Captura 22: LazyColumn con las ocho aplicaciones; búsqueda "d"; búsqueda combinada con el modo favoritas.</w:t>
       </w:r>
     </w:p>
     <w:p>
@@ -3653,7 +3653,7 @@
           <w:color w:val="000000"/>
           <w:sz w:val="32"/>
         </w:rPr>
-        <w:t>Etapa 4 - La navegacion como estado, y la muerte de la grieta</w:t>
+        <w:t>Etapa 4 - Navegación como estado</w:t>
       </w:r>
     </w:p>
     <w:p>
@@ -3664,7 +3664,7 @@
           <w:color w:val="000000"/>
           <w:sz w:val="24"/>
         </w:rPr>
-        <w:t>La pantalla actual pasó a ser un valor nulable del ViewModel, appSeleccionada: StateFlow&lt;App?&gt;. Con una app seleccionada se ve DetalleApp; con null, la lista; BackHandler traduce "atrás" a volverALista(). Experimento de la grieta por tercera vez: Google Maps sin estrella, marcarla desde el detalle y volver.</w:t>
+        <w:t>La pantalla actual se representa con un valor nulable del ViewModel, appSeleccionada: StateFlow&lt;App?&gt;. Si existe una aplicación seleccionada se muestra DetalleApp; si el valor es null, se muestra la lista. BackHandler convierte el evento de retroceso en una llamada a volverALista(). Se repitió la prueba de la pantalla de detalle: se marcó Google Maps desde el detalle y se regresó a la lista.</w:t>
       </w:r>
     </w:p>
     <w:p>
@@ -3788,7 +3788,7 @@
           <w:color w:val="000000"/>
           <w:sz w:val="22"/>
         </w:rPr>
-        <w:t>Captura 23: DetalleApp; Google Maps marcada desde el detalle; al volver ya aparece marcada y primera, sin onResume ni refrescar().</w:t>
+        <w:t>Captura 23: DetalleApp; Google Maps marcada desde el detalle; al regresar, la lista la muestra marcada y en primer lugar, sin necesidad de onResume ni refrescar().</w:t>
       </w:r>
     </w:p>
     <w:p>
@@ -3799,7 +3799,7 @@
           <w:color w:val="000000"/>
           <w:sz w:val="24"/>
         </w:rPr>
-        <w:t>La grieta murió sin parche: el detalle y la lista son dos descripciones derivadas del mismo ViewModel, así que alternarFavorita publica la lista nueva y todo lo que la lee se recompone. No se arregló el bug: se eligió una arquitectura donde no tiene dónde existir.</w:t>
+        <w:t>El problema no se presentó: la lista y el detalle se derivan del mismo ViewModel, por lo que alternarFavorita publica la lista nueva y todas las funciones que la leen se recomponen. La arquitectura elegida no deja lugar para este error.</w:t>
       </w:r>
     </w:p>
     <w:p>
@@ -3813,7 +3813,7 @@
           <w:color w:val="000000"/>
           <w:sz w:val="32"/>
         </w:rPr>
-        <w:t>Etapa 5 - La prueba de fuego final</w:t>
+        <w:t>Etapa 5 - Verificación</w:t>
       </w:r>
     </w:p>
     <w:p>
@@ -3824,7 +3824,7 @@
           <w:color w:val="000000"/>
           <w:sz w:val="24"/>
         </w:rPr>
-        <w:t>5.1: WhatsApp, Reddit y Google Maps marcadas, búsqueda "d", modo activo, detalle de Reddit abierto y giro. El detalle siguió abierto y, al volver, búsqueda, modo y estrellas estaban intactos. En el Logcat no hubo ningún ViewModel nuevo: la selección era estado del ViewModel y sobrevivió.</w:t>
+        <w:t>5.1: con WhatsApp, Reddit y Google Maps marcadas, la búsqueda "d", el modo activo y el detalle de Reddit abierto, se rotó el dispositivo. El detalle permaneció abierto y, al regresar, la búsqueda, el modo y los favoritos se mantuvieron. El Logcat no registró la creación de un nuevo ViewModel: la selección forma parte del estado del ViewModel y se conservó.</w:t>
       </w:r>
     </w:p>
     <w:p>
@@ -3911,7 +3911,7 @@
           <w:color w:val="000000"/>
           <w:sz w:val="22"/>
         </w:rPr>
-        <w:t>Captura 24: detalle de Reddit antes y después del giro.</w:t>
+        <w:t>Captura 24: detalle de Reddit antes y después de la rotación.</w:t>
       </w:r>
     </w:p>
     <w:p>
@@ -3961,7 +3961,7 @@
           <w:color w:val="000000"/>
           <w:sz w:val="22"/>
         </w:rPr>
-        <w:t>Captura 25: al volver atrás: búsqueda, modo y estrellas intactos.</w:t>
+        <w:t>Captura 25: al regresar a la lista: búsqueda, modo y favoritos se conservan.</w:t>
       </w:r>
     </w:p>
     <w:p>
@@ -4008,7 +4008,7 @@
           <w:color w:val="000000"/>
           <w:sz w:val="22"/>
         </w:rPr>
-        <w:t>Captura 26: Logcat del giro en el detalle: sin líneas nuevas del ViewModel.</w:t>
+        <w:t>Captura 26: Logcat durante la rotación en el detalle: no se registran nuevas instancias del ViewModel.</w:t>
       </w:r>
     </w:p>
     <w:p>
@@ -4019,7 +4019,7 @@
           <w:color w:val="000000"/>
           <w:sz w:val="24"/>
         </w:rPr>
-        <w:t>5.2, la muerte de proceso: favoritos y modo en blanco, como en 3B. El texto "d" volvió porque rememberSaveable usa el mecanismo de rescate del sistema, pero volvió sin disparar onValueChange, y el query del ViewModel nació vacío: el texto dice "d" y la lista muestra las 8 apps. Las dos defensas quedaron desalineadas.</w:t>
+        <w:t>5.2: tras la terminación del proceso, los favoritos y el modo se perdieron, igual que en 3B. El texto "d" se restauró porque rememberSaveable utiliza el mecanismo de guardado del sistema, pero la restauración no invoca onValueChange y el query del ViewModel se inicializó vacío: el campo muestra "d" y la lista presenta las ocho aplicaciones. Los dos mecanismos de persistencia quedaron desalineados.</w:t>
       </w:r>
     </w:p>
     <w:p>
@@ -4106,7 +4106,7 @@
           <w:color w:val="000000"/>
           <w:sz w:val="22"/>
         </w:rPr>
-        <w:t>Captura 27: antes del kill; después, el texto "d" volvió pero la lista está sin filtrar.</w:t>
+        <w:t>Captura 27: antes de la terminación del proceso; después, el texto "d" se restaura pero la lista no está filtrada.</w:t>
       </w:r>
     </w:p>
     <w:p>
@@ -4153,7 +4153,7 @@
           <w:color w:val="000000"/>
           <w:sz w:val="22"/>
         </w:rPr>
-        <w:t>Captura 28: Logcat tras el kill: PID nuevo y ViewModel nuevo.</w:t>
+        <w:t>Captura 28: Logcat posterior a la terminación: nuevo PID y nueva instancia del ViewModel.</w:t>
       </w:r>
     </w:p>
     <w:p>
@@ -4167,7 +4167,7 @@
           <w:color w:val="000000"/>
           <w:sz w:val="32"/>
         </w:rPr>
-        <w:t>Desafios opcionales 3C</w:t>
+        <w:t>Desafíos opcionales 3C</w:t>
       </w:r>
     </w:p>
     <w:p>
@@ -4181,7 +4181,7 @@
           <w:color w:val="000000"/>
           <w:sz w:val="26"/>
         </w:rPr>
-        <w:t>3. La biblioteca de verdad: Navigation Compose</w:t>
+        <w:t>3. Navigation Compose</w:t>
       </w:r>
     </w:p>
     <w:p>
@@ -4192,7 +4192,7 @@
           <w:color w:val="000000"/>
           <w:sz w:val="24"/>
         </w:rPr>
-        <w:t>Se agregó navigation-compose 2.9.3 y el if se reemplazó por un NavHost con dos rutas: "lista" y "detalle/{appId}". El detalle busca su app por id en el catálogo completo que publica el ViewModel. Un detalle importante: el ViewModel se pide fuera del NavHost y se pasa a los destinos. Si se pidiera adentro, viewModel() quedaría atado a cada entrada de la pila, cada pantalla tendría el suyo y la grieta volvería. Se gana una pila real (el botón atrás funciona sin BackHandler), rutas con argumentos y la pila restaurada incluso tras la muerte del proceso. Se paga con más ceremonia: rutas en texto, argumentos tipados y un controlador. Con dos pantallas el if alcanza; con una app como la del TP la biblioteca se vuelve obligatoria.</w:t>
+        <w:t>Se agregó navigation-compose 2.9.3 y la estructura condicional se reemplazó por un NavHost con dos rutas: "lista" y "detalle/{appId}". El detalle obtiene la aplicación por su identificador desde el catálogo completo que publica el ViewModel. El ViewModel se solicita fuera del NavHost y se transfiere a los destinos: si se solicitara dentro de un destino, viewModel() quedaría asociado a esa entrada de la pila, cada pantalla tendría su propia instancia y el problema de sincronización volvería a presentarse. Entre las ventajas se encuentran una pila de navegación real (el retroceso no requiere BackHandler), rutas con argumentos y la restauración de la pantalla incluso después de la terminación del proceso. Como contrapartida, se requieren rutas, argumentos tipados y un controlador de navegación. Para dos pantallas la estructura condicional es suficiente; en una aplicación de mayor tamaño, como la del trabajo práctico, la biblioteca resulta necesaria.</w:t>
       </w:r>
     </w:p>
     <w:p>
@@ -4316,7 +4316,7 @@
           <w:color w:val="000000"/>
           <w:sz w:val="22"/>
         </w:rPr>
-        <w:t>Captura 29: detalle de Duolingo por ruta; al volver, Duolingo marcada y primera; tras girar y matar el proceso, el NavHost restaura el detalle de WhatsApp.</w:t>
+        <w:t>Captura 29: detalle de Duolingo mediante una ruta; al regresar, Duolingo aparece marcada y en primer lugar; tras rotar y terminar el proceso, el NavHost restaura el detalle de WhatsApp.</w:t>
       </w:r>
     </w:p>
     <w:p>
@@ -4366,7 +4366,7 @@
           <w:color w:val="000000"/>
           <w:sz w:val="22"/>
         </w:rPr>
-        <w:t>Captura 30: el detalle abierto con Navigation Compose sobrevive al giro.</w:t>
+        <w:t>Captura 30: el detalle abierto con Navigation Compose se conserva al rotar.</w:t>
       </w:r>
     </w:p>
     <w:p>
@@ -4380,7 +4380,7 @@
           <w:color w:val="000000"/>
           <w:sz w:val="26"/>
         </w:rPr>
-        <w:t>4. El caramelo: animateItem</w:t>
+        <w:t>4. Animación de elementos: animateItem</w:t>
       </w:r>
     </w:p>
     <w:p>
@@ -4391,7 +4391,7 @@
           <w:color w:val="000000"/>
           <w:sz w:val="24"/>
         </w:rPr>
-        <w:t>A cada fila de la LazyColumn se le agregó Modifier.animateItem(). Al marcar GitHub, la fila sube animada hasta el principio, gracias a "favoritas primero". Funciona porque key = { it.id } le dice a Compose qué fila es cuál entre recomposiciones: sin la key, Compose solo vería que cambió el contenido de cada posición y no podría animar un movimiento.</w:t>
+        <w:t>Se aplicó Modifier.animateItem() a cada fila de la LazyColumn. Al marcar GitHub, la fila se desplaza con una animación hasta el primer lugar, como consecuencia del ordenamiento de favoritas. El mecanismo funciona porque key = { it.id } permite a Compose identificar cada fila entre recomposiciones; sin la clave, Compose solo detectaría un cambio de contenido en cada posición y no podría animar el desplazamiento.</w:t>
       </w:r>
     </w:p>
     <w:p>
@@ -4478,7 +4478,7 @@
           <w:color w:val="000000"/>
           <w:sz w:val="22"/>
         </w:rPr>
-        <w:t>Captura 31: captura en plena animación: GitHub pasa sobre Mercado Pago; al terminar, GitHub queda primera.</w:t>
+        <w:t>Captura 31: captura durante la animación: GitHub se desplaza sobre Mercado Pago; al finalizar, GitHub ocupa el primer lugar.</w:t>
       </w:r>
     </w:p>
     <w:p>
@@ -4492,7 +4492,7 @@
           <w:color w:val="000000"/>
           <w:sz w:val="26"/>
         </w:rPr>
-        <w:t>5. Alinear las defensas</w:t>
+        <w:t>5. Alineación de los mecanismos de persistencia</w:t>
       </w:r>
     </w:p>
     <w:p>
@@ -4503,7 +4503,7 @@
           <w:color w:val="000000"/>
           <w:sz w:val="24"/>
         </w:rPr>
-        <w:t>query y soloFavoritas se mudaron al SavedStateHandle del ViewModel, y el campo de texto quedó controlado desde el ViewModel: textoBusqueda es un StateFlow obtenido con state.getStateFlow("query", ""), sin rememberSaveable. Se repitió la muerte de proceso con GitHub y Duolingo marcadas, búsqueda "d" y modo activo: ahora el texto, el filtro y el modo volvieron juntos y coherentes. Lo único que sigue muriendo son los favoritos, y eso ya no es un problema de estado sino de datos: necesitan persistencia real, que es el Laboratorio 4.</w:t>
+        <w:t>query y soloFavoritas se trasladaron al SavedStateHandle del ViewModel, y el campo de texto pasó a controlarse desde el ViewModel: textoBusqueda es un StateFlow obtenido mediante state.getStateFlow("query", ""), sin rememberSaveable. Se repitió la terminación del proceso con GitHub y Duolingo marcadas, la búsqueda "d" y el modo activo. El texto, el filtro y el modo se restauraron de forma coherente. La única información que continúa perdiéndose son los favoritos, lo que ya no constituye un problema de estado sino de datos, que requieren almacenamiento persistente (tema del Laboratorio 4).</w:t>
       </w:r>
     </w:p>
     <w:p>
@@ -4590,7 +4590,7 @@
           <w:color w:val="000000"/>
           <w:sz w:val="22"/>
         </w:rPr>
-        <w:t>Captura 32: antes del kill; después, texto "d" y modo favoritas coherentes y la lista vacía porque murieron los favoritos.</w:t>
+        <w:t>Captura 32: antes de la terminación del proceso; después, el texto "d" y el modo favoritas son coherentes y la lista está vacía porque se perdieron los favoritos.</w:t>
       </w:r>
     </w:p>
     <w:p>
@@ -4637,7 +4637,7 @@
           <w:color w:val="000000"/>
           <w:sz w:val="22"/>
         </w:rPr>
-        <w:t>Captura 33: Logcat del kill con las defensas alineadas.</w:t>
+        <w:t>Captura 33: Logcat de la terminación del proceso con los mecanismos alineados.</w:t>
       </w:r>
     </w:p>
     <w:p>
@@ -4763,7 +4763,7 @@
                 <w:color w:val="000000"/>
                 <w:sz w:val="20"/>
               </w:rPr>
-              <w:t>4 piezas en 2 archivos: item_app.xml, ViewHolder, adaptador con 3 métodos y enganche (~85 líneas). Con DiffUtil, una más: el ItemCallback.</w:t>
+              <w:t>Cuatro componentes en dos archivos: item_app.xml, ViewHolder, adaptador con tres métodos y configuración (aproximadamente 85 líneas). Con DiffUtil se agrega el ItemCallback.</w:t>
             </w:r>
           </w:p>
         </w:tc>
@@ -4780,7 +4780,7 @@
                 <w:color w:val="000000"/>
                 <w:sz w:val="20"/>
               </w:rPr>
-              <w:t>Las mismas 4 piezas: la interfaz no cambió.</w:t>
+              <w:t>Los mismos cuatro componentes, ya que la interfaz no se modificó.</w:t>
             </w:r>
           </w:p>
         </w:tc>
@@ -4797,7 +4797,7 @@
                 <w:color w:val="000000"/>
                 <w:sz w:val="20"/>
               </w:rPr>
-              <w:t>Una LazyColumn con items y key, más la fila: 2 composables, ~40 líneas, sin XML ni ids.</w:t>
+              <w:t>Una LazyColumn con items y key, y la función de la fila: dos funciones, aproximadamente 40 líneas, sin XML ni identificadores.</w:t>
             </w:r>
           </w:p>
         </w:tc>
@@ -4833,7 +4833,7 @@
                 <w:color w:val="000000"/>
                 <w:sz w:val="20"/>
               </w:rPr>
-              <w:t>Búsqueda en el EditText, modo en una variable de la Activity, favoritos en Catalogo.</w:t>
+              <w:t>Búsqueda en el EditText, modo en una variable de la Activity y favoritos en Catalogo.</w:t>
             </w:r>
           </w:p>
         </w:tc>
@@ -4867,7 +4867,7 @@
                 <w:color w:val="000000"/>
                 <w:sz w:val="20"/>
               </w:rPr>
-              <w:t>Igual que 3B con StateFlow, más la navegación. El texto, en rememberSaveable (o en el ViewModel con el desafío 5).</w:t>
+              <w:t>Igual que en 3B con StateFlow, más el estado de navegación. El texto en rememberSaveable (o en el ViewModel con el desafío 5).</w:t>
             </w:r>
           </w:p>
         </w:tc>
@@ -4886,7 +4886,7 @@
                 <w:color w:val="000000"/>
                 <w:sz w:val="20"/>
               </w:rPr>
-              <w:t>¿Qué sobrevivió y qué murió al rotar? ¿Y al morir el proceso?</w:t>
+              <w:t>¿Qué se conserva y qué se pierde al rotar y al terminar el proceso?</w:t>
             </w:r>
           </w:p>
         </w:tc>
@@ -4903,7 +4903,7 @@
                 <w:color w:val="000000"/>
                 <w:sz w:val="20"/>
               </w:rPr>
-              <w:t>Giro: sobreviven el texto (vista con id) y los favoritos (proceso vivo); muere el modo. Proceso: solo el texto.</w:t>
+              <w:t>Rotación: se conservan el texto (vista con id) y los favoritos (el proceso sigue activo); se pierde el modo. Proceso: solo se conserva el texto.</w:t>
             </w:r>
           </w:p>
         </w:tc>
@@ -4920,7 +4920,7 @@
                 <w:color w:val="000000"/>
                 <w:sz w:val="20"/>
               </w:rPr>
-              <w:t>Giro: todo, porque el ViewModel no se recrea. Proceso: mueren el ViewModel y el singleton; el texto vuelve y refiltra.</w:t>
+              <w:t>Rotación: se conserva todo, porque el ViewModel no se recrea. Proceso: se pierden el ViewModel y el singleton; el texto se restaura y vuelve a filtrar.</w:t>
             </w:r>
           </w:p>
         </w:tc>
@@ -4937,7 +4937,7 @@
                 <w:color w:val="000000"/>
                 <w:sz w:val="20"/>
               </w:rPr>
-              <w:t>Giro: todo, incluso la pantalla de detalle abierta. Proceso: mueren favoritos y modo; el texto vuelve pero sin filtrar.</w:t>
+              <w:t>Rotación: se conserva todo, incluida la pantalla de detalle. Proceso: se pierden favoritos y modo; el texto se restaura sin filtrar.</w:t>
             </w:r>
           </w:p>
         </w:tc>
@@ -4973,7 +4973,7 @@
                 <w:color w:val="000000"/>
                 <w:sz w:val="20"/>
               </w:rPr>
-              <w:t>Data class, item_app.xml, ViewHolder, onBind, layout y Activity del detalle: 5 lugares en 4 archivos.</w:t>
+              <w:t>Modificar la data class, item_app.xml, el ViewHolder, onBindViewHolder y el layout y la Activity del detalle: cinco puntos en cuatro archivos.</w:t>
             </w:r>
           </w:p>
         </w:tc>
@@ -4990,7 +4990,7 @@
                 <w:color w:val="000000"/>
                 <w:sz w:val="20"/>
               </w:rPr>
-              <w:t>Lo mismo en la vista; el ViewModel no cambia salvo que el campo filtre u ordene.</w:t>
+              <w:t>Los mismos cambios en la vista; el ViewModel solo se modifica si el campo interviene en el filtrado o el orden.</w:t>
             </w:r>
           </w:p>
         </w:tc>
@@ -5007,7 +5007,7 @@
                 <w:color w:val="000000"/>
                 <w:sz w:val="20"/>
               </w:rPr>
-              <w:t>Data class y un Text en FilaApp y en DetalleApp: 2 o 3 lugares, todo en Kotlin.</w:t>
+              <w:t>Modificar la data class y agregar un Text en FilaApp y en DetalleApp: dos o tres puntos, todos en Kotlin.</w:t>
             </w:r>
           </w:p>
         </w:tc>
@@ -5026,7 +5026,7 @@
                 <w:color w:val="000000"/>
                 <w:sz w:val="20"/>
               </w:rPr>
-              <w:t>¿Qué se podría probar sin abrir un emulador?</w:t>
+              <w:t>¿Qué se puede probar sin emulador?</w:t>
             </w:r>
           </w:p>
         </w:tc>
@@ -5043,7 +5043,7 @@
                 <w:color w:val="000000"/>
                 <w:sz w:val="20"/>
               </w:rPr>
-              <w:t>Casi nada: aplicarFiltros() lee un EditText y escribe en un Button; necesita una Activity viva.</w:t>
+              <w:t>Prácticamente nada: aplicarFiltros() lee un EditText y escribe en un Button, por lo que requiere una Activity en ejecución.</w:t>
             </w:r>
           </w:p>
         </w:tc>
@@ -5060,7 +5060,7 @@
                 <w:color w:val="000000"/>
                 <w:sz w:val="20"/>
               </w:rPr>
-              <w:t>Todo el filtrado: el ViewModel no importa clases de interfaz. 6 tests JUnit pasando.</w:t>
+              <w:t>Toda la lógica de filtrado, ya que el ViewModel no depende de clases de interfaz. Se implementaron 6 pruebas JUnit exitosas.</w:t>
             </w:r>
           </w:p>
         </w:tc>
@@ -5077,7 +5077,7 @@
                 <w:color w:val="000000"/>
                 <w:sz w:val="20"/>
               </w:rPr>
-              <w:t>Lo mismo que 3B; StateFlow siempre tiene .value, así que es más simple de leer en un test.</w:t>
+              <w:t>Lo mismo que en 3B; StateFlow siempre expone un valor, lo que simplifica las verificaciones.</w:t>
             </w:r>
           </w:p>
         </w:tc>
@@ -5096,7 +5096,7 @@
                 <w:color w:val="000000"/>
                 <w:sz w:val="20"/>
               </w:rPr>
-              <w:t>¿Qué se sintió mejor y qué peor?</w:t>
+              <w:t>¿Qué aspectos resultaron favorables y cuáles desfavorables?</w:t>
             </w:r>
           </w:p>
         </w:tc>
@@ -5113,7 +5113,7 @@
                 <w:color w:val="000000"/>
                 <w:sz w:val="20"/>
               </w:rPr>
-              <w:t>Mejor: todo es explícito. Peor: ser el sincronizador; el giro y la grieta muestran lo frágil que es.</w:t>
+              <w:t>Favorable: el flujo es explícito y fácil de seguir. Desfavorable: la sincronización es manual; la rotación y la pantalla de detalle evidencian su fragilidad.</w:t>
             </w:r>
           </w:p>
         </w:tc>
@@ -5130,7 +5130,7 @@
                 <w:color w:val="000000"/>
                 <w:sz w:val="20"/>
               </w:rPr>
-              <w:t>Mejor: el giro dejó de ser un problema y la lógica se puede testear. Peor: sigue la ceremonia de XML y adaptador; la grieta pide un parche.</w:t>
+              <w:t>Favorable: la rotación deja de ser un problema y la lógica puede probarse. Desfavorable: se mantiene la estructura de XML y adaptador, y la pantalla de detalle requiere una corrección.</w:t>
             </w:r>
           </w:p>
         </w:tc>
@@ -5147,7 +5147,7 @@
                 <w:color w:val="000000"/>
                 <w:sz w:val="20"/>
               </w:rPr>
-              <w:t>Mejor: la pantalla es función del estado, la grieta murió sola y hay mucho menos código. Peor: reglas nuevas (inmutabilidad, recomposición, componente controlado).</w:t>
+              <w:t>Favorable: la pantalla es una función del estado, el problema de sincronización desaparece y el código es más breve. Desfavorable: exige incorporar conceptos nuevos (inmutabilidad, recomposición, componentes controlados).</w:t>
             </w:r>
           </w:p>
         </w:tc>
@@ -5162,7 +5162,7 @@
           <w:color w:val="000000"/>
           <w:sz w:val="24"/>
         </w:rPr>
-        <w:t>La fila 1 mide la ceremonia (cuatro piezas, cuatro piezas, una función). Las filas 2 y 3 miden dónde vive el estado y qué le pasa (variables que mueren, un ViewModel que sobrevive, lo mismo más la navegación). La fila 5 mide la testeabilidad (imposible, de regalo, de regalo). De 3A a 3B cambió la organización; de 3B a 3C cambió la interfaz, y el ViewModel se mudó casi sin tocarlo.</w:t>
+        <w:t>La primera fila mide la cantidad de estructura necesaria (cuatro componentes, cuatro componentes y una función). La segunda y la tercera miden dónde reside el estado y cómo se comporta ante la rotación y la terminación del proceso. La quinta mide la posibilidad de realizar pruebas (nula, completa y completa). Entre 3A y 3B se modificó la organización del código; entre 3B y 3C se modificó la interfaz, y el ViewModel se reutilizó con cambios mínimos.</w:t>
       </w:r>
     </w:p>
     <w:p>
@@ -5188,7 +5188,7 @@
           <w:color w:val="000000"/>
           <w:sz w:val="24"/>
         </w:rPr>
-        <w:t>1. Un equipo mantiene una app Views+XML grande, estable y rentable. ¿Le recomiendo reescribirla en Compose?</w:t>
+        <w:t>1. Un equipo mantiene una aplicación Views+XML grande, estable y rentable. ¿Se recomienda reescribirla en Compose?</w:t>
       </w:r>
     </w:p>
     <w:p>
@@ -5199,7 +5199,7 @@
           <w:color w:val="000000"/>
           <w:sz w:val="24"/>
         </w:rPr>
-        <w:t>No. La fila 4 de la columna B muestra que cada campo toca cuatro o cinco lugares entre XML, adaptador y Activity; multiplicado por veinte pantallas, una reescritura completa son meses de trabajo sin valor nuevo para el usuario. Recomiendo migrar por capas: primero llevar el estado a ViewModels, como en 3B, que ya arregla el giro y habilita tests (filas 3 y 5), y escribir en Compose solo las pantallas nuevas o las que haya que rehacer de todos modos, porque Compose y Views pueden convivir. Como se vio en 3C, un ViewModel bien hecho se muda casi sin tocarlo.</w:t>
+        <w:t>No se recomienda una reescritura completa. La cuarta fila de la columna B muestra que cada campo nuevo implica cambios en cuatro o cinco puntos entre XML, adaptador y Activity; en una aplicación de veinte pantallas, una reescritura total demandaría meses de trabajo sin aportar funcionalidad nueva al usuario. Se recomienda una migración gradual: en primer lugar, trasladar el estado a ViewModels, como en 3B, lo que resuelve la pérdida de estado al rotar y habilita las pruebas unitarias (filas 3 y 5); en segundo lugar, desarrollar en Compose únicamente las pantallas nuevas o las que deban rehacerse, dado que Compose y Views pueden coexistir. Como se verificó en 3C, un ViewModel bien diseñado puede reutilizarse con cambios mínimos.</w:t>
       </w:r>
     </w:p>
     <w:p>
@@ -5211,7 +5211,7 @@
           <w:color w:val="000000"/>
           <w:sz w:val="24"/>
         </w:rPr>
-        <w:t>2. El mismo equipo arranca un producto nuevo desde cero. ¿Qué stack elijo y por qué?</w:t>
+        <w:t>2. El mismo equipo inicia un producto nuevo. ¿Qué tecnología se elige y por qué?</w:t>
       </w:r>
     </w:p>
     <w:p>
@@ -5222,7 +5222,7 @@
           <w:color w:val="000000"/>
           <w:sz w:val="24"/>
         </w:rPr>
-        <w:t>Compose con MVVM: ViewModel con StateFlow, Navigation Compose y una capa de datos persistente. Fila 1: la lista cuesta una función en vez de cuatro piezas. Fila 3: el estado sobrevive al giro, incluida la pantalla actual, y la grieta del detalle no tiene dónde existir. Fila 5: la lógica se prueba con JUnit sin emulador. Fila 4: un campo nuevo toca menos lugares. Lo pendiente, que ninguna de las tres formas resuelve sola, es la muerte del proceso: SavedStateHandle para el estado chico y persistencia real para los datos.</w:t>
+        <w:t>Se elige Compose con MVVM: ViewModel con StateFlow, Navigation Compose y una capa de datos persistente. Según la ficha, la lista requiere una función en lugar de cuatro componentes (fila 1); el estado se conserva al rotar, incluida la pantalla actual, y el problema de sincronización del detalle no puede presentarse (fila 3); la lógica puede probarse con JUnit sin emulador (fila 5); y agregar un campo implica menos cambios (fila 4). Queda pendiente la terminación del proceso, que ninguna de las tres formas resuelve por sí sola: requiere SavedStateHandle para el estado de la pantalla y almacenamiento persistente para los datos.</w:t>
       </w:r>
     </w:p>
     <w:p>
@@ -5236,7 +5236,7 @@
           <w:color w:val="000000"/>
           <w:sz w:val="32"/>
         </w:rPr>
-        <w:t>Reflexion final</w:t>
+        <w:t>Conclusión</w:t>
       </w:r>
     </w:p>
     <w:p>
@@ -5247,7 +5247,7 @@
           <w:color w:val="000000"/>
           <w:sz w:val="24"/>
         </w:rPr>
-        <w:t>Construir la misma app tres veces dejó claro que "moderno" no es una opinión: cada forma se puede medir con la ficha. El modelo tradicional me obligó a ser el sincronizador; MVVM mudó el estado a un lugar que el giro no toca; Compose hizo que la pantalla fuera una función del estado y el redibujado dejó de ser mi problema. Queda abierta la pregunta que los tres laboratorios dejaron sin resolver: los favoritos siguen muriendo con el proceso, porque son datos y no estado de pantalla. Eso es el Laboratorio 4: un backend y el catálogo viviendo en la nube.</w:t>
+        <w:t>La construcción de la misma aplicación con tres enfoques permitió comparar cada uno con criterios medibles, registrados en la ficha comparativa. El modelo tradicional exige sincronizar manualmente la vista con los datos; MVVM traslada el estado a un componente que sobrevive a la recreación de la Activity; Compose define la interfaz como una función del estado y elimina la necesidad de redibujar manualmente. El aspecto que ninguno de los tres enfoques resuelve es la persistencia de los datos ante la terminación del proceso, ya que los favoritos no son estado de la pantalla sino datos de la aplicación. Ese es el objetivo del Laboratorio 4: incorporar un backend y almacenar el catálogo en la nube.</w:t>
       </w:r>
     </w:p>
     <w:sectPr>

</xml_diff>